<commit_message>
Mejora en la pagina de formatos, mejora en el formato visual, mejora en los reportes solicitado por Nestor (totales)
</commit_message>
<xml_diff>
--- a/app/assets/Formato_control_de_correspondencia_y_SECOP II.docx
+++ b/app/assets/Formato_control_de_correspondencia_y_SECOP II.docx
@@ -491,15 +491,6 @@
         </w:rPr>
         <w:t xml:space="preserve"> </w:t>
       </w:r>
-      <w:r>
-        <w:rPr>
-          <w:rFonts w:ascii="Arial Narrow" w:hAnsi="Arial Narrow"/>
-          <w:b/>
-          <w:bCs/>
-          <w:color w:val="FF0000"/>
-        </w:rPr>
-        <w:t>(NO APLICA)</w:t>
-      </w:r>
     </w:p>
     <w:p>
       <w:pPr>
@@ -615,6 +606,62 @@
           <w:b/>
         </w:rPr>
       </w:pPr>
+      <w:r>
+        <w:rPr>
+          <w:rFonts w:ascii="Arial Narrow" w:hAnsi="Arial Narrow"/>
+          <w:b/>
+          <w:noProof/>
+        </w:rPr>
+        <w:drawing>
+          <wp:anchor distT="0" distB="0" distL="114300" distR="114300" simplePos="0" relativeHeight="251659264" behindDoc="0" locked="0" layoutInCell="1" allowOverlap="1" wp14:anchorId="19697E78" wp14:editId="30A4D4F0">
+            <wp:simplePos x="0" y="0"/>
+            <wp:positionH relativeFrom="column">
+              <wp:posOffset>2490785</wp:posOffset>
+            </wp:positionH>
+            <wp:positionV relativeFrom="paragraph">
+              <wp:posOffset>181640</wp:posOffset>
+            </wp:positionV>
+            <wp:extent cx="694998" cy="576000"/>
+            <wp:effectExtent l="0" t="0" r="0" b="0"/>
+            <wp:wrapNone/>
+            <wp:docPr id="266475385" name="Imagen 1"/>
+            <wp:cNvGraphicFramePr>
+              <a:graphicFrameLocks xmlns:a="http://schemas.openxmlformats.org/drawingml/2006/main" noChangeAspect="1"/>
+            </wp:cNvGraphicFramePr>
+            <a:graphic xmlns:a="http://schemas.openxmlformats.org/drawingml/2006/main">
+              <a:graphicData uri="http://schemas.openxmlformats.org/drawingml/2006/picture">
+                <pic:pic xmlns:pic="http://schemas.openxmlformats.org/drawingml/2006/picture">
+                  <pic:nvPicPr>
+                    <pic:cNvPr id="266475385" name="Imagen 266475385"/>
+                    <pic:cNvPicPr/>
+                  </pic:nvPicPr>
+                  <pic:blipFill>
+                    <a:blip r:embed="rId9"/>
+                    <a:stretch>
+                      <a:fillRect/>
+                    </a:stretch>
+                  </pic:blipFill>
+                  <pic:spPr>
+                    <a:xfrm>
+                      <a:off x="0" y="0"/>
+                      <a:ext cx="694998" cy="576000"/>
+                    </a:xfrm>
+                    <a:prstGeom prst="rect">
+                      <a:avLst/>
+                    </a:prstGeom>
+                  </pic:spPr>
+                </pic:pic>
+              </a:graphicData>
+            </a:graphic>
+            <wp14:sizeRelH relativeFrom="margin">
+              <wp14:pctWidth>0</wp14:pctWidth>
+            </wp14:sizeRelH>
+            <wp14:sizeRelV relativeFrom="margin">
+              <wp14:pctHeight>0</wp14:pctHeight>
+            </wp14:sizeRelV>
+          </wp:anchor>
+        </w:drawing>
+      </w:r>
       <w:r>
         <w:rPr>
           <w:rFonts w:ascii="Arial Narrow" w:hAnsi="Arial Narrow"/>
@@ -781,10 +828,45 @@
         </w:rPr>
       </w:pPr>
     </w:p>
+    <w:p>
+      <w:pPr>
+        <w:pStyle w:val="Sinespaciado"/>
+        <w:rPr>
+          <w:rFonts w:ascii="Arial Narrow" w:hAnsi="Arial Narrow" w:cs="Arial"/>
+          <w:color w:val="7F7F7F" w:themeColor="text1" w:themeTint="80"/>
+        </w:rPr>
+      </w:pPr>
+      <w:r>
+        <w:rPr>
+          <w:rFonts w:ascii="Arial Narrow" w:hAnsi="Arial Narrow"/>
+          <w:b/>
+          <w:color w:val="7F7F7F" w:themeColor="text1" w:themeTint="80"/>
+        </w:rPr>
+        <w:t>{</w:t>
+      </w:r>
+      <w:proofErr w:type="spellStart"/>
+      <w:r>
+        <w:rPr>
+          <w:rFonts w:ascii="Arial Narrow" w:hAnsi="Arial Narrow"/>
+          <w:b/>
+          <w:color w:val="7F7F7F" w:themeColor="text1" w:themeTint="80"/>
+        </w:rPr>
+        <w:t>id_formato</w:t>
+      </w:r>
+      <w:proofErr w:type="spellEnd"/>
+      <w:r>
+        <w:rPr>
+          <w:rFonts w:ascii="Arial Narrow" w:hAnsi="Arial Narrow"/>
+          <w:b/>
+          <w:color w:val="7F7F7F" w:themeColor="text1" w:themeTint="80"/>
+        </w:rPr>
+        <w:t>}</w:t>
+      </w:r>
+    </w:p>
     <w:sectPr>
-      <w:headerReference w:type="even" r:id="rId9"/>
-      <w:headerReference w:type="default" r:id="rId10"/>
-      <w:headerReference w:type="first" r:id="rId11"/>
+      <w:headerReference w:type="even" r:id="rId10"/>
+      <w:headerReference w:type="default" r:id="rId11"/>
+      <w:headerReference w:type="first" r:id="rId12"/>
       <w:pgSz w:w="12240" w:h="15840"/>
       <w:pgMar w:top="851" w:right="1701" w:bottom="1418" w:left="1701" w:header="720" w:footer="720" w:gutter="0"/>
       <w:cols w:space="720"/>

</xml_diff>